<commit_message>
melhorias análise dos proxies
</commit_message>
<xml_diff>
--- a/templates/report_template.docx
+++ b/templates/report_template.docx
@@ -2692,9 +2692,9 @@
   <w:style w:type="paragraph" w:default="1" w:styleId="Normal">
     <w:name w:val="Normal"/>
     <w:qFormat/>
-    <w:rsid w:val="006A5BA5"/>
+    <w:rsid w:val="008B4D0A"/>
     <w:pPr>
-      <w:spacing w:after="0" w:line="240" w:lineRule="auto"/>
+      <w:spacing w:before="80" w:after="80" w:line="240" w:lineRule="auto"/>
     </w:pPr>
     <w:rPr>
       <w:rFonts w:ascii="Calibri" w:hAnsi="Calibri" w:cs="Calibri"/>
@@ -2917,9 +2917,6 @@
     <w:uiPriority w:val="10"/>
     <w:qFormat/>
     <w:rsid w:val="00180C19"/>
-    <w:pPr>
-      <w:contextualSpacing/>
-    </w:pPr>
     <w:rPr>
       <w:rFonts w:asciiTheme="majorHAnsi" w:eastAsiaTheme="majorEastAsia" w:hAnsiTheme="majorHAnsi" w:cstheme="majorBidi"/>
       <w:spacing w:val="-10"/>
@@ -3476,28 +3473,15 @@
 </file>
 
 <file path=customXml/item1.xml><?xml version="1.0" encoding="utf-8"?>
-<b:Sources xmlns:b="http://schemas.openxmlformats.org/officeDocument/2006/bibliography" xmlns="http://schemas.openxmlformats.org/officeDocument/2006/bibliography" SelectedStyle="\APASixthEditionOfficeOnline.xsl" StyleName="APA" Version="6"/>
+<?mso-contentType ?>
+<FormTemplates xmlns="http://schemas.microsoft.com/sharepoint/v3/contenttype/forms">
+  <Display>DocumentLibraryForm</Display>
+  <Edit>DocumentLibraryForm</Edit>
+  <New>DocumentLibraryForm</New>
+</FormTemplates>
 </file>
 
 <file path=customXml/item2.xml><?xml version="1.0" encoding="utf-8"?>
-<p:properties xmlns:p="http://schemas.microsoft.com/office/2006/metadata/properties" xmlns:xsi="http://www.w3.org/2001/XMLSchema-instance" xmlns:pc="http://schemas.microsoft.com/office/infopath/2007/PartnerControls">
-  <documentManagement>
-    <SharedWithUsers xmlns="7694fa78-a933-42bc-8f1a-5e01a67ca4a9">
-      <UserInfo>
-        <DisplayName>Tatiane Rosa</DisplayName>
-        <AccountId>11</AccountId>
-        <AccountType/>
-      </UserInfo>
-    </SharedWithUsers>
-    <TaxCatchAll xmlns="7694fa78-a933-42bc-8f1a-5e01a67ca4a9" xsi:nil="true"/>
-    <lcf76f155ced4ddcb4097134ff3c332f xmlns="a239996a-6723-470e-9524-70eed2b2907a">
-      <Terms xmlns="http://schemas.microsoft.com/office/infopath/2007/PartnerControls"/>
-    </lcf76f155ced4ddcb4097134ff3c332f>
-  </documentManagement>
-</p:properties>
-</file>
-
-<file path=customXml/item3.xml><?xml version="1.0" encoding="utf-8"?>
 <ct:contentTypeSchema xmlns:ct="http://schemas.microsoft.com/office/2006/metadata/contentType" xmlns:ma="http://schemas.microsoft.com/office/2006/metadata/properties/metaAttributes" ct:_="" ma:_="" ma:contentTypeName="Documento" ma:contentTypeID="0x010100F83D2A91062ACB4382484AFF96E76480" ma:contentTypeVersion="18" ma:contentTypeDescription="Crie um novo documento." ma:contentTypeScope="" ma:versionID="e01c617b165918b3a5427e88da4a0bab">
   <xsd:schema xmlns:xsd="http://www.w3.org/2001/XMLSchema" xmlns:xs="http://www.w3.org/2001/XMLSchema" xmlns:p="http://schemas.microsoft.com/office/2006/metadata/properties" xmlns:ns2="a239996a-6723-470e-9524-70eed2b2907a" xmlns:ns3="7694fa78-a933-42bc-8f1a-5e01a67ca4a9" targetNamespace="http://schemas.microsoft.com/office/2006/metadata/properties" ma:root="true" ma:fieldsID="2b76cf281033ca27723fc04c8da8ccb6" ns2:_="" ns3:_="">
     <xsd:import namespace="a239996a-6723-470e-9524-70eed2b2907a"/>
@@ -3752,35 +3736,37 @@
 </ct:contentTypeSchema>
 </file>
 
+<file path=customXml/item3.xml><?xml version="1.0" encoding="utf-8"?>
+<p:properties xmlns:p="http://schemas.microsoft.com/office/2006/metadata/properties" xmlns:xsi="http://www.w3.org/2001/XMLSchema-instance" xmlns:pc="http://schemas.microsoft.com/office/infopath/2007/PartnerControls">
+  <documentManagement>
+    <SharedWithUsers xmlns="7694fa78-a933-42bc-8f1a-5e01a67ca4a9">
+      <UserInfo>
+        <DisplayName>Tatiane Rosa</DisplayName>
+        <AccountId>11</AccountId>
+        <AccountType/>
+      </UserInfo>
+    </SharedWithUsers>
+    <TaxCatchAll xmlns="7694fa78-a933-42bc-8f1a-5e01a67ca4a9" xsi:nil="true"/>
+    <lcf76f155ced4ddcb4097134ff3c332f xmlns="a239996a-6723-470e-9524-70eed2b2907a">
+      <Terms xmlns="http://schemas.microsoft.com/office/infopath/2007/PartnerControls"/>
+    </lcf76f155ced4ddcb4097134ff3c332f>
+  </documentManagement>
+</p:properties>
+</file>
+
 <file path=customXml/item4.xml><?xml version="1.0" encoding="utf-8"?>
-<?mso-contentType ?>
-<FormTemplates xmlns="http://schemas.microsoft.com/sharepoint/v3/contenttype/forms">
-  <Display>DocumentLibraryForm</Display>
-  <Edit>DocumentLibraryForm</Edit>
-  <New>DocumentLibraryForm</New>
-</FormTemplates>
+<b:Sources xmlns:b="http://schemas.openxmlformats.org/officeDocument/2006/bibliography" xmlns="http://schemas.openxmlformats.org/officeDocument/2006/bibliography" SelectedStyle="\APASixthEditionOfficeOnline.xsl" StyleName="APA" Version="6"/>
 </file>
 
 <file path=customXml/itemProps1.xml><?xml version="1.0" encoding="utf-8"?>
-<ds:datastoreItem xmlns:ds="http://schemas.openxmlformats.org/officeDocument/2006/customXml" ds:itemID="{DCBCD7C6-5059-4A74-9E85-072832180C74}">
+<ds:datastoreItem xmlns:ds="http://schemas.openxmlformats.org/officeDocument/2006/customXml" ds:itemID="{5D211BDE-C965-47D9-A4FE-A3A84C08C5C2}">
   <ds:schemaRefs>
-    <ds:schemaRef ds:uri="http://schemas.openxmlformats.org/officeDocument/2006/bibliography"/>
+    <ds:schemaRef ds:uri="http://schemas.microsoft.com/sharepoint/v3/contenttype/forms"/>
   </ds:schemaRefs>
 </ds:datastoreItem>
 </file>
 
 <file path=customXml/itemProps2.xml><?xml version="1.0" encoding="utf-8"?>
-<ds:datastoreItem xmlns:ds="http://schemas.openxmlformats.org/officeDocument/2006/customXml" ds:itemID="{296B2FE1-B814-4357-B5AC-ECF7F4F2A8FB}">
-  <ds:schemaRefs>
-    <ds:schemaRef ds:uri="http://schemas.microsoft.com/office/2006/metadata/properties"/>
-    <ds:schemaRef ds:uri="http://schemas.microsoft.com/office/infopath/2007/PartnerControls"/>
-    <ds:schemaRef ds:uri="7694fa78-a933-42bc-8f1a-5e01a67ca4a9"/>
-    <ds:schemaRef ds:uri="a239996a-6723-470e-9524-70eed2b2907a"/>
-  </ds:schemaRefs>
-</ds:datastoreItem>
-</file>
-
-<file path=customXml/itemProps3.xml><?xml version="1.0" encoding="utf-8"?>
 <ds:datastoreItem xmlns:ds="http://schemas.openxmlformats.org/officeDocument/2006/customXml" ds:itemID="{51CA2EFD-2383-426A-B0D7-3F19672E6B1E}">
   <ds:schemaRefs>
     <ds:schemaRef ds:uri="http://schemas.microsoft.com/office/2006/metadata/contentType"/>
@@ -3799,10 +3785,21 @@
 </ds:datastoreItem>
 </file>
 
+<file path=customXml/itemProps3.xml><?xml version="1.0" encoding="utf-8"?>
+<ds:datastoreItem xmlns:ds="http://schemas.openxmlformats.org/officeDocument/2006/customXml" ds:itemID="{296B2FE1-B814-4357-B5AC-ECF7F4F2A8FB}">
+  <ds:schemaRefs>
+    <ds:schemaRef ds:uri="http://schemas.microsoft.com/office/2006/metadata/properties"/>
+    <ds:schemaRef ds:uri="http://schemas.microsoft.com/office/infopath/2007/PartnerControls"/>
+    <ds:schemaRef ds:uri="7694fa78-a933-42bc-8f1a-5e01a67ca4a9"/>
+    <ds:schemaRef ds:uri="a239996a-6723-470e-9524-70eed2b2907a"/>
+  </ds:schemaRefs>
+</ds:datastoreItem>
+</file>
+
 <file path=customXml/itemProps4.xml><?xml version="1.0" encoding="utf-8"?>
-<ds:datastoreItem xmlns:ds="http://schemas.openxmlformats.org/officeDocument/2006/customXml" ds:itemID="{5D211BDE-C965-47D9-A4FE-A3A84C08C5C2}">
+<ds:datastoreItem xmlns:ds="http://schemas.openxmlformats.org/officeDocument/2006/customXml" ds:itemID="{DCBCD7C6-5059-4A74-9E85-072832180C74}">
   <ds:schemaRefs>
-    <ds:schemaRef ds:uri="http://schemas.microsoft.com/sharepoint/v3/contenttype/forms"/>
+    <ds:schemaRef ds:uri="http://schemas.openxmlformats.org/officeDocument/2006/bibliography"/>
   </ds:schemaRefs>
 </ds:datastoreItem>
 </file>
</xml_diff>